<commit_message>
Select MO Item in multi production booking
</commit_message>
<xml_diff>
--- a/APLOS/POPResources/Templates/PackingList202034.docx
+++ b/APLOS/POPResources/Templates/PackingList202034.docx
@@ -10,10 +10,10 @@
         <w:tblLook w:val="04A0" w:firstRow="1" w:lastRow="0" w:firstColumn="1" w:lastColumn="0" w:noHBand="0" w:noVBand="1"/>
       </w:tblPr>
       <w:tblGrid>
-        <w:gridCol w:w="4701"/>
+        <w:gridCol w:w="4699"/>
         <w:gridCol w:w="1269"/>
         <w:gridCol w:w="387"/>
-        <w:gridCol w:w="5428"/>
+        <w:gridCol w:w="5430"/>
       </w:tblGrid>
       <w:tr>
         <w:trPr>
@@ -71,60 +71,146 @@
             <w:pPr>
               <w:rPr>
                 <w:rFonts w:ascii="Arial" w:hAnsi="Arial" w:cs="Arial"/>
+                <w:sz w:val="18"/>
+                <w:szCs w:val="18"/>
+              </w:rPr>
+            </w:pPr>
+            <w:r>
+              <w:rPr>
+                <w:rFonts w:ascii="Arial" w:hAnsi="Arial" w:cs="Arial"/>
                 <w:sz w:val="16"/>
                 <w:szCs w:val="16"/>
               </w:rPr>
-            </w:pPr>
-            <w:r>
-              <w:rPr>
-                <w:rFonts w:ascii="Arial" w:hAnsi="Arial" w:cs="Arial"/>
-                <w:sz w:val="16"/>
-                <w:szCs w:val="16"/>
-              </w:rPr>
-              <w:t>Office Address: KSSDIC, Plot No:34</w:t>
-            </w:r>
-          </w:p>
-          <w:p>
-            <w:pPr>
-              <w:rPr>
-                <w:rFonts w:ascii="Arial" w:hAnsi="Arial" w:cs="Arial"/>
-              </w:rPr>
-            </w:pPr>
-            <w:r>
-              <w:rPr>
-                <w:rFonts w:ascii="Arial" w:hAnsi="Arial" w:cs="Arial"/>
-                <w:sz w:val="16"/>
-                <w:szCs w:val="16"/>
-              </w:rPr>
-              <w:t xml:space="preserve">Yelahanka New </w:t>
+              <w:t xml:space="preserve">Office Address: </w:t>
+            </w:r>
+            <w:r>
+              <w:rPr>
+                <w:rFonts w:ascii="Arial" w:hAnsi="Arial" w:cs="Arial"/>
+                <w:sz w:val="18"/>
+                <w:szCs w:val="18"/>
+              </w:rPr>
+              <w:t xml:space="preserve"> </w:t>
             </w:r>
             <w:proofErr w:type="spellStart"/>
-            <w:proofErr w:type="gramStart"/>
-            <w:r>
-              <w:rPr>
-                <w:rFonts w:ascii="Arial" w:hAnsi="Arial" w:cs="Arial"/>
-                <w:sz w:val="16"/>
-                <w:szCs w:val="16"/>
-              </w:rPr>
-              <w:t>Bengaluru,Karnataka</w:t>
+            <w:r>
+              <w:rPr>
+                <w:rFonts w:ascii="Arial" w:hAnsi="Arial" w:cs="Arial"/>
+                <w:sz w:val="18"/>
+                <w:szCs w:val="18"/>
+              </w:rPr>
+              <w:t>Village:Akbarpur</w:t>
             </w:r>
             <w:proofErr w:type="spellEnd"/>
-            <w:proofErr w:type="gramEnd"/>
-            <w:r>
-              <w:rPr>
-                <w:rFonts w:ascii="Arial" w:hAnsi="Arial" w:cs="Arial"/>
-                <w:sz w:val="16"/>
-                <w:szCs w:val="16"/>
+            <w:r>
+              <w:rPr>
+                <w:rFonts w:ascii="Arial" w:hAnsi="Arial" w:cs="Arial"/>
+                <w:sz w:val="18"/>
+                <w:szCs w:val="18"/>
+              </w:rPr>
+              <w:t xml:space="preserve"> </w:t>
+            </w:r>
+            <w:proofErr w:type="spellStart"/>
+            <w:r>
+              <w:rPr>
+                <w:rFonts w:ascii="Arial" w:hAnsi="Arial" w:cs="Arial"/>
+                <w:sz w:val="18"/>
+                <w:szCs w:val="18"/>
+              </w:rPr>
+              <w:t>Channa</w:t>
+            </w:r>
+            <w:r>
+              <w:rPr>
+                <w:rFonts w:ascii="Arial" w:hAnsi="Arial" w:cs="Arial"/>
+                <w:sz w:val="18"/>
+                <w:szCs w:val="18"/>
+              </w:rPr>
+              <w:t>,</w:t>
+            </w:r>
+            <w:r>
+              <w:rPr>
+                <w:rFonts w:ascii="Arial" w:hAnsi="Arial" w:cs="Arial"/>
+                <w:sz w:val="18"/>
+                <w:szCs w:val="18"/>
+              </w:rPr>
+              <w:t>Ludhiana</w:t>
+            </w:r>
+            <w:proofErr w:type="spellEnd"/>
+            <w:r>
+              <w:rPr>
+                <w:rFonts w:ascii="Arial" w:hAnsi="Arial" w:cs="Arial"/>
+                <w:sz w:val="18"/>
+                <w:szCs w:val="18"/>
               </w:rPr>
               <w:t xml:space="preserve"> -</w:t>
             </w:r>
-            <w:r>
-              <w:rPr>
-                <w:rFonts w:ascii="Arial" w:hAnsi="Arial" w:cs="Arial"/>
-                <w:sz w:val="16"/>
-                <w:szCs w:val="16"/>
-              </w:rPr>
-              <w:t>560064,INDIA</w:t>
+            <w:proofErr w:type="spellStart"/>
+            <w:r>
+              <w:rPr>
+                <w:rFonts w:ascii="Arial" w:hAnsi="Arial" w:cs="Arial"/>
+                <w:sz w:val="18"/>
+                <w:szCs w:val="18"/>
+              </w:rPr>
+              <w:t>Malerkotla</w:t>
+            </w:r>
+            <w:proofErr w:type="spellEnd"/>
+            <w:r>
+              <w:rPr>
+                <w:rFonts w:ascii="Arial" w:hAnsi="Arial" w:cs="Arial"/>
+                <w:sz w:val="18"/>
+                <w:szCs w:val="18"/>
+              </w:rPr>
+              <w:t xml:space="preserve"> </w:t>
+            </w:r>
+            <w:proofErr w:type="spellStart"/>
+            <w:r>
+              <w:rPr>
+                <w:rFonts w:ascii="Arial" w:hAnsi="Arial" w:cs="Arial"/>
+                <w:sz w:val="18"/>
+                <w:szCs w:val="18"/>
+              </w:rPr>
+              <w:t>Road,Near</w:t>
+            </w:r>
+            <w:proofErr w:type="spellEnd"/>
+            <w:r>
+              <w:rPr>
+                <w:rFonts w:ascii="Arial" w:hAnsi="Arial" w:cs="Arial"/>
+                <w:sz w:val="18"/>
+                <w:szCs w:val="18"/>
+              </w:rPr>
+              <w:t xml:space="preserve">: </w:t>
+            </w:r>
+            <w:proofErr w:type="spellStart"/>
+            <w:r>
+              <w:rPr>
+                <w:rFonts w:ascii="Arial" w:hAnsi="Arial" w:cs="Arial"/>
+                <w:sz w:val="18"/>
+                <w:szCs w:val="18"/>
+              </w:rPr>
+              <w:t>Ahmedgarh</w:t>
+            </w:r>
+            <w:proofErr w:type="spellEnd"/>
+            <w:r>
+              <w:rPr>
+                <w:rFonts w:ascii="Arial" w:hAnsi="Arial" w:cs="Arial"/>
+                <w:sz w:val="18"/>
+                <w:szCs w:val="18"/>
+              </w:rPr>
+              <w:t xml:space="preserve"> - 148021</w:t>
+            </w:r>
+          </w:p>
+          <w:p>
+            <w:pPr>
+              <w:rPr>
+                <w:rFonts w:ascii="Arial" w:hAnsi="Arial" w:cs="Arial"/>
+              </w:rPr>
+            </w:pPr>
+            <w:r>
+              <w:rPr>
+                <w:rFonts w:ascii="Arial" w:hAnsi="Arial" w:cs="Arial"/>
+                <w:sz w:val="18"/>
+                <w:szCs w:val="18"/>
+              </w:rPr>
+              <w:t>Distt: Sangrur - Punjab</w:t>
             </w:r>
           </w:p>
         </w:tc>
@@ -249,18 +335,7 @@
                 <w:sz w:val="20"/>
                 <w:szCs w:val="20"/>
               </w:rPr>
-              <w:t xml:space="preserve">Invoice / Packing </w:t>
-            </w:r>
-            <w:proofErr w:type="gramStart"/>
-            <w:r>
-              <w:rPr>
-                <w:rFonts w:ascii="Arial" w:hAnsi="Arial" w:cs="Arial"/>
-                <w:b/>
-                <w:bCs/>
-                <w:sz w:val="20"/>
-                <w:szCs w:val="20"/>
-              </w:rPr>
-              <w:t>Date:</w:t>
+              <w:t>Invoice / Packing Date:</w:t>
             </w:r>
             <w:r>
               <w:rPr>
@@ -271,7 +346,6 @@
               <w:t>{</w:t>
             </w:r>
             <w:proofErr w:type="spellStart"/>
-            <w:proofErr w:type="gramEnd"/>
             <w:r>
               <w:rPr>
                 <w:rFonts w:ascii="Arial" w:hAnsi="Arial" w:cs="Arial"/>
@@ -445,7 +519,6 @@
               <w:t xml:space="preserve"> {</w:t>
             </w:r>
             <w:proofErr w:type="spellStart"/>
-            <w:proofErr w:type="gramStart"/>
             <w:r>
               <w:rPr>
                 <w:rFonts w:ascii="Arial" w:hAnsi="Arial" w:cs="Arial"/>
@@ -478,16 +551,7 @@
                 <w:b/>
                 <w:bCs/>
               </w:rPr>
-              <w:t xml:space="preserve">  </w:t>
-            </w:r>
-            <w:proofErr w:type="gramEnd"/>
-            <w:r>
-              <w:rPr>
-                <w:rFonts w:ascii="Arial" w:hAnsi="Arial" w:cs="Arial"/>
-                <w:b/>
-                <w:bCs/>
-              </w:rPr>
-              <w:t xml:space="preserve"> </w:t>
+              <w:t xml:space="preserve">   </w:t>
             </w:r>
             <w:r>
               <w:rPr>
@@ -679,7 +743,6 @@
               </w:rPr>
             </w:pPr>
             <w:proofErr w:type="spellStart"/>
-            <w:proofErr w:type="gramStart"/>
             <w:r>
               <w:rPr>
                 <w:rFonts w:ascii="Arial" w:hAnsi="Arial" w:cs="Arial"/>
@@ -689,7 +752,6 @@
               <w:t>Village:Akbarpur</w:t>
             </w:r>
             <w:proofErr w:type="spellEnd"/>
-            <w:proofErr w:type="gramEnd"/>
             <w:r>
               <w:rPr>
                 <w:rFonts w:ascii="Arial" w:hAnsi="Arial" w:cs="Arial"/>
@@ -1445,7 +1507,7 @@
       </w:tr>
       <w:tr>
         <w:trPr>
-          <w:trHeight w:val="1037"/>
+          <w:trHeight w:val="1393"/>
         </w:trPr>
         <w:tc>
           <w:tcPr>
@@ -1463,6 +1525,18 @@
                 <w:u w:val="single"/>
               </w:rPr>
             </w:pPr>
+          </w:p>
+          <w:p>
+            <w:pPr>
+              <w:rPr>
+                <w:rFonts w:ascii="Arial" w:hAnsi="Arial" w:cs="Arial"/>
+                <w:b/>
+                <w:bCs/>
+                <w:sz w:val="20"/>
+                <w:szCs w:val="20"/>
+                <w:u w:val="single"/>
+              </w:rPr>
+            </w:pPr>
             <w:r>
               <w:rPr>
                 <w:rFonts w:ascii="Arial" w:hAnsi="Arial" w:cs="Arial"/>
@@ -1533,6 +1607,16 @@
                 <w:bCs/>
               </w:rPr>
             </w:pPr>
+            <w:r>
+              <w:rPr>
+                <w:rFonts w:ascii="Arial Narrow" w:hAnsi="Arial Narrow" w:cs="Tahoma"/>
+                <w:b/>
+                <w:bCs/>
+                <w:sz w:val="19"/>
+                <w:szCs w:val="19"/>
+              </w:rPr>
+              <w:br/>
+            </w:r>
             <w:r>
               <w:rPr>
                 <w:rFonts w:ascii="Arial" w:hAnsi="Arial" w:cs="Arial"/>
@@ -1690,7 +1774,21 @@
         <w:sz w:val="14"/>
         <w:szCs w:val="14"/>
       </w:rPr>
-      <w:t>Printed By: {</w:t>
+      <w:t>Print</w:t>
+    </w:r>
+    <w:r>
+      <w:rPr>
+        <w:sz w:val="14"/>
+        <w:szCs w:val="14"/>
+      </w:rPr>
+      <w:t>ing</w:t>
+    </w:r>
+    <w:r>
+      <w:rPr>
+        <w:sz w:val="14"/>
+        <w:szCs w:val="14"/>
+      </w:rPr>
+      <w:t xml:space="preserve"> By: {</w:t>
     </w:r>
     <w:proofErr w:type="spellStart"/>
     <w:r>
@@ -1714,6 +1812,7 @@
         <w:szCs w:val="14"/>
       </w:rPr>
       <w:tab/>
+      <w:t xml:space="preserve">                     </w:t>
     </w:r>
     <w:r>
       <w:rPr>
@@ -1728,14 +1827,21 @@
         <w:szCs w:val="14"/>
       </w:rPr>
       <w:tab/>
+      <w:t xml:space="preserve">              </w:t>
     </w:r>
     <w:r>
       <w:rPr>
         <w:sz w:val="14"/>
         <w:szCs w:val="14"/>
       </w:rPr>
-      <w:tab/>
-      <w:t xml:space="preserve"> Created By: {</w:t>
+      <w:t xml:space="preserve">         </w:t>
+    </w:r>
+    <w:r>
+      <w:rPr>
+        <w:sz w:val="14"/>
+        <w:szCs w:val="14"/>
+      </w:rPr>
+      <w:t xml:space="preserve">  Created By: {</w:t>
     </w:r>
     <w:proofErr w:type="spellStart"/>
     <w:r>
@@ -1779,53 +1885,37 @@
         <w:sz w:val="14"/>
         <w:szCs w:val="14"/>
       </w:rPr>
-      <w:tab/>
+      <w:t>Print</w:t>
     </w:r>
     <w:r>
       <w:rPr>
         <w:sz w:val="14"/>
         <w:szCs w:val="14"/>
       </w:rPr>
-      <w:tab/>
-      <w:t xml:space="preserve">           </w:t>
+      <w:t>ing</w:t>
     </w:r>
     <w:r>
       <w:rPr>
         <w:sz w:val="14"/>
         <w:szCs w:val="14"/>
       </w:rPr>
-      <w:t>Printed Time: {DT}</w:t>
+      <w:t xml:space="preserve"> Time: {DT}</w:t>
     </w:r>
   </w:p>
   <w:p>
     <w:pPr>
+      <w:jc w:val="center"/>
+    </w:pPr>
+  </w:p>
+  <w:p>
+    <w:pPr>
+      <w:jc w:val="center"/>
+    </w:pPr>
+  </w:p>
+  <w:p>
+    <w:pPr>
       <w:pStyle w:val="Footer"/>
-      <w:rPr>
-        <w:sz w:val="14"/>
-        <w:szCs w:val="14"/>
-      </w:rPr>
     </w:pPr>
-    <w:r>
-      <w:rPr>
-        <w:sz w:val="14"/>
-        <w:szCs w:val="14"/>
-      </w:rPr>
-      <w:tab/>
-    </w:r>
-    <w:r>
-      <w:rPr>
-        <w:sz w:val="14"/>
-        <w:szCs w:val="14"/>
-      </w:rPr>
-      <w:tab/>
-    </w:r>
-    <w:r>
-      <w:rPr>
-        <w:sz w:val="14"/>
-        <w:szCs w:val="14"/>
-      </w:rPr>
-      <w:tab/>
-    </w:r>
   </w:p>
 </w:ftr>
 </file>
@@ -2109,10 +2199,10 @@
       </w:pPr>
     </w:lvl>
   </w:abstractNum>
-  <w:num w:numId="1" w16cid:durableId="9185218">
+  <w:num w:numId="1" w16cid:durableId="510684734">
     <w:abstractNumId w:val="1"/>
   </w:num>
-  <w:num w:numId="2" w16cid:durableId="537477934">
+  <w:num w:numId="2" w16cid:durableId="2088533057">
     <w:abstractNumId w:val="0"/>
   </w:num>
 </w:numbering>
@@ -2516,6 +2606,7 @@
   <w:style w:type="paragraph" w:default="1" w:styleId="Normal">
     <w:name w:val="Normal"/>
     <w:qFormat/>
+    <w:rsid w:val="00A545BF"/>
   </w:style>
   <w:style w:type="character" w:default="1" w:styleId="DefaultParagraphFont">
     <w:name w:val="Default Paragraph Font"/>

</xml_diff>